<commit_message>
feat: add multi-language support
</commit_message>
<xml_diff>
--- a/PRD/usecase (1).docx
+++ b/PRD/usecase (1).docx
@@ -2525,9 +2525,27 @@
                 <w:rFonts w:ascii="Times New Roman" w:hAnsi="Times New Roman" w:cs="Times New Roman"/>
               </w:rPr>
             </w:pPr>
-            <w:r>
-              <w:t>Nhóm Đồ Án</w:t>
-            </w:r>
+            <w:proofErr w:type="spellStart"/>
+            <w:r>
+              <w:t>Nhóm</w:t>
+            </w:r>
+            <w:proofErr w:type="spellEnd"/>
+            <w:r>
+              <w:t xml:space="preserve"> </w:t>
+            </w:r>
+            <w:proofErr w:type="spellStart"/>
+            <w:r>
+              <w:t>Đồ</w:t>
+            </w:r>
+            <w:proofErr w:type="spellEnd"/>
+            <w:r>
+              <w:t xml:space="preserve"> </w:t>
+            </w:r>
+            <w:proofErr w:type="spellStart"/>
+            <w:r>
+              <w:t>Án</w:t>
+            </w:r>
+            <w:proofErr w:type="spellEnd"/>
           </w:p>
         </w:tc>
       </w:tr>
@@ -3189,7 +3207,15 @@
               </w:rPr>
             </w:pPr>
             <w:r>
-              <w:t>1. The Visitor walks into the trigger radius (trigger_radius_meters) of a POI.</w:t>
+              <w:t>1. The Visitor walks into the trigger radius (</w:t>
+            </w:r>
+            <w:proofErr w:type="spellStart"/>
+            <w:r>
+              <w:t>trigger_radius_meters</w:t>
+            </w:r>
+            <w:proofErr w:type="spellEnd"/>
+            <w:r>
+              <w:t>) of a POI.</w:t>
             </w:r>
           </w:p>
         </w:tc>
@@ -3736,7 +3762,15 @@
               </w:rPr>
             </w:pPr>
             <w:r>
-              <w:t>8. System records the playback timestamp into the history list (lastPlayedMap) and starts the cooldown timer (e.g., 300 seconds).</w:t>
+              <w:t>8. System records the playback timestamp into the history list (</w:t>
+            </w:r>
+            <w:proofErr w:type="spellStart"/>
+            <w:r>
+              <w:t>lastPlayedMap</w:t>
+            </w:r>
+            <w:proofErr w:type="spellEnd"/>
+            <w:r>
+              <w:t>) and starts the cooldown timer (e.g., 300 seconds).</w:t>
             </w:r>
           </w:p>
         </w:tc>
@@ -4430,7 +4464,15 @@
               </w:rPr>
             </w:pPr>
             <w:r>
-              <w:t>Active Cooldown Period: At {Cooldown Check}, if the elapsed time since the last playback is less than cooldown_seconds,</w:t>
+              <w:t xml:space="preserve">Active Cooldown Period: At {Cooldown Check}, if the elapsed time since the last playback is less than </w:t>
+            </w:r>
+            <w:proofErr w:type="spellStart"/>
+            <w:r>
+              <w:t>cooldown_seconds</w:t>
+            </w:r>
+            <w:proofErr w:type="spellEnd"/>
+            <w:r>
+              <w:t>,</w:t>
             </w:r>
           </w:p>
         </w:tc>
@@ -4621,7 +4663,31 @@
               <w:spacing w:line="276" w:lineRule="auto"/>
             </w:pPr>
             <w:r>
-              <w:t>Evaluates the formula CurrentTime - LastPlayedTime &gt; CooldownDuration.</w:t>
+              <w:t xml:space="preserve">Evaluates the formula </w:t>
+            </w:r>
+            <w:proofErr w:type="spellStart"/>
+            <w:r>
+              <w:t>CurrentTime</w:t>
+            </w:r>
+            <w:proofErr w:type="spellEnd"/>
+            <w:r>
+              <w:t xml:space="preserve"> - </w:t>
+            </w:r>
+            <w:proofErr w:type="spellStart"/>
+            <w:r>
+              <w:t>LastPlayedTime</w:t>
+            </w:r>
+            <w:proofErr w:type="spellEnd"/>
+            <w:r>
+              <w:t xml:space="preserve"> &gt; </w:t>
+            </w:r>
+            <w:proofErr w:type="spellStart"/>
+            <w:r>
+              <w:t>CooldownDuration</w:t>
+            </w:r>
+            <w:proofErr w:type="spellEnd"/>
+            <w:r>
+              <w:t>.</w:t>
             </w:r>
           </w:p>
         </w:tc>
@@ -5113,6 +5179,7 @@
                 <w:rFonts w:ascii="Times New Roman" w:hAnsi="Times New Roman" w:cs="Times New Roman"/>
                 <w:b/>
                 <w:bCs/>
+                <w:noProof/>
                 <w:lang w:val="vi-VN"/>
               </w:rPr>
               <w:lastRenderedPageBreak/>
@@ -5781,7 +5848,15 @@
               </w:rPr>
             </w:pPr>
             <w:r>
-              <w:t>5. The optical engine scans and decodes the unique identifier (qr_code_key) from the QR code image.</w:t>
+              <w:t>5. The optical engine scans and decodes the unique identifier (</w:t>
+            </w:r>
+            <w:proofErr w:type="spellStart"/>
+            <w:r>
+              <w:t>qr_code_key</w:t>
+            </w:r>
+            <w:proofErr w:type="spellEnd"/>
+            <w:r>
+              <w:t>) from the QR code image.</w:t>
             </w:r>
           </w:p>
         </w:tc>
@@ -5856,7 +5931,31 @@
               </w:rPr>
             </w:pPr>
             <w:r>
-              <w:t>6. The system closes the scanner viewfinder and sends an API request to fetch content: GET /api/v1/pois/by-qr/{qrKey}.</w:t>
+              <w:t>6. The system closes the scanner viewfinder and sends an API request to fetch content: GET /</w:t>
+            </w:r>
+            <w:proofErr w:type="spellStart"/>
+            <w:r>
+              <w:t>api</w:t>
+            </w:r>
+            <w:proofErr w:type="spellEnd"/>
+            <w:r>
+              <w:t>/v1/pois/by-</w:t>
+            </w:r>
+            <w:proofErr w:type="spellStart"/>
+            <w:r>
+              <w:t>qr</w:t>
+            </w:r>
+            <w:proofErr w:type="spellEnd"/>
+            <w:r>
+              <w:t>/{</w:t>
+            </w:r>
+            <w:proofErr w:type="spellStart"/>
+            <w:r>
+              <w:t>qrKey</w:t>
+            </w:r>
+            <w:proofErr w:type="spellEnd"/>
+            <w:r>
+              <w:t>}.</w:t>
             </w:r>
           </w:p>
         </w:tc>
@@ -6088,7 +6187,23 @@
               </w:rPr>
             </w:pPr>
             <w:r>
-              <w:t>10. The system logs an anonymous playback entry with trigger_method = "qr_code" and syncs historical metrics. The use case ends.</w:t>
+              <w:t xml:space="preserve">10. The system logs an anonymous playback entry with </w:t>
+            </w:r>
+            <w:proofErr w:type="spellStart"/>
+            <w:r>
+              <w:t>trigger_method</w:t>
+            </w:r>
+            <w:proofErr w:type="spellEnd"/>
+            <w:r>
+              <w:t xml:space="preserve"> = "</w:t>
+            </w:r>
+            <w:proofErr w:type="spellStart"/>
+            <w:r>
+              <w:t>qr_code</w:t>
+            </w:r>
+            <w:proofErr w:type="spellEnd"/>
+            <w:r>
+              <w:t>" and syncs historical metrics. The use case ends.</w:t>
             </w:r>
           </w:p>
         </w:tc>
@@ -6937,7 +7052,28 @@
               </w:rPr>
             </w:pPr>
             <w:r>
-              <w:t>Verifies and requests OS runtime camera hardware permissions (android.permission.CAMERA / iOS NSCameraUsageDescription).</w:t>
+              <w:t>Verifies and requests OS runtime camera hardware permissions (</w:t>
+            </w:r>
+            <w:proofErr w:type="spellStart"/>
+            <w:proofErr w:type="gramStart"/>
+            <w:r>
+              <w:t>android.permission</w:t>
+            </w:r>
+            <w:proofErr w:type="gramEnd"/>
+            <w:r>
+              <w:t>.CAMERA</w:t>
+            </w:r>
+            <w:proofErr w:type="spellEnd"/>
+            <w:r>
+              <w:t xml:space="preserve"> / iOS </w:t>
+            </w:r>
+            <w:proofErr w:type="spellStart"/>
+            <w:r>
+              <w:t>NSCameraUsageDescription</w:t>
+            </w:r>
+            <w:proofErr w:type="spellEnd"/>
+            <w:r>
+              <w:t>).</w:t>
             </w:r>
           </w:p>
         </w:tc>
@@ -11060,8 +11196,8 @@
     </w:p>
     <w:tbl>
       <w:tblPr>
+        <w:tblpPr w:leftFromText="180" w:rightFromText="180" w:horzAnchor="margin" w:tblpXSpec="center" w:tblpY="-1440"/>
         <w:tblW w:w="11120" w:type="dxa"/>
-        <w:tblInd w:w="-113" w:type="dxa"/>
         <w:tblBorders>
           <w:top w:val="single" w:sz="4" w:space="0" w:color="auto"/>
           <w:left w:val="single" w:sz="4" w:space="0" w:color="auto"/>
@@ -14441,15 +14577,10 @@
         </w:tc>
       </w:tr>
       <w:tr>
-        <w:tblPrEx>
-          <w:jc w:val="center"/>
-          <w:tblInd w:w="0" w:type="dxa"/>
-        </w:tblPrEx>
         <w:trPr>
           <w:gridAfter w:val="2"/>
           <w:wAfter w:w="112" w:type="dxa"/>
           <w:trHeight w:val="350"/>
-          <w:jc w:val="center"/>
         </w:trPr>
         <w:tc>
           <w:tcPr>
@@ -14513,15 +14644,10 @@
         </w:tc>
       </w:tr>
       <w:tr>
-        <w:tblPrEx>
-          <w:jc w:val="center"/>
-          <w:tblInd w:w="0" w:type="dxa"/>
-        </w:tblPrEx>
         <w:trPr>
           <w:gridAfter w:val="2"/>
           <w:wAfter w:w="112" w:type="dxa"/>
           <w:trHeight w:val="350"/>
-          <w:jc w:val="center"/>
         </w:trPr>
         <w:tc>
           <w:tcPr>
@@ -14578,15 +14704,10 @@
         </w:tc>
       </w:tr>
       <w:tr>
-        <w:tblPrEx>
-          <w:jc w:val="center"/>
-          <w:tblInd w:w="0" w:type="dxa"/>
-        </w:tblPrEx>
         <w:trPr>
           <w:gridAfter w:val="2"/>
           <w:wAfter w:w="112" w:type="dxa"/>
           <w:trHeight w:val="593"/>
-          <w:jc w:val="center"/>
         </w:trPr>
         <w:tc>
           <w:tcPr>
@@ -14644,15 +14765,10 @@
         </w:tc>
       </w:tr>
       <w:tr>
-        <w:tblPrEx>
-          <w:jc w:val="center"/>
-          <w:tblInd w:w="0" w:type="dxa"/>
-        </w:tblPrEx>
         <w:trPr>
           <w:gridAfter w:val="2"/>
           <w:wAfter w:w="112" w:type="dxa"/>
           <w:trHeight w:val="791"/>
-          <w:jc w:val="center"/>
         </w:trPr>
         <w:tc>
           <w:tcPr>
@@ -14710,15 +14826,10 @@
         </w:tc>
       </w:tr>
       <w:tr>
-        <w:tblPrEx>
-          <w:jc w:val="center"/>
-          <w:tblInd w:w="0" w:type="dxa"/>
-        </w:tblPrEx>
         <w:trPr>
           <w:gridAfter w:val="2"/>
           <w:wAfter w:w="112" w:type="dxa"/>
           <w:trHeight w:val="63"/>
-          <w:jc w:val="center"/>
         </w:trPr>
         <w:tc>
           <w:tcPr>
@@ -14763,15 +14874,10 @@
         </w:tc>
       </w:tr>
       <w:tr>
-        <w:tblPrEx>
-          <w:jc w:val="center"/>
-          <w:tblInd w:w="0" w:type="dxa"/>
-        </w:tblPrEx>
         <w:trPr>
           <w:gridAfter w:val="2"/>
           <w:wAfter w:w="112" w:type="dxa"/>
           <w:trHeight w:val="809"/>
-          <w:jc w:val="center"/>
         </w:trPr>
         <w:tc>
           <w:tcPr>
@@ -14823,15 +14929,10 @@
         </w:tc>
       </w:tr>
       <w:tr>
-        <w:tblPrEx>
-          <w:jc w:val="center"/>
-          <w:tblInd w:w="0" w:type="dxa"/>
-        </w:tblPrEx>
         <w:trPr>
           <w:gridAfter w:val="2"/>
           <w:wAfter w:w="112" w:type="dxa"/>
           <w:trHeight w:val="377"/>
-          <w:jc w:val="center"/>
         </w:trPr>
         <w:tc>
           <w:tcPr>
@@ -14866,15 +14967,10 @@
         </w:tc>
       </w:tr>
       <w:tr>
-        <w:tblPrEx>
-          <w:jc w:val="center"/>
-          <w:tblInd w:w="0" w:type="dxa"/>
-        </w:tblPrEx>
         <w:trPr>
           <w:gridAfter w:val="2"/>
           <w:wAfter w:w="112" w:type="dxa"/>
           <w:trHeight w:val="314"/>
-          <w:jc w:val="center"/>
         </w:trPr>
         <w:tc>
           <w:tcPr>
@@ -14909,15 +15005,10 @@
         </w:tc>
       </w:tr>
       <w:tr>
-        <w:tblPrEx>
-          <w:jc w:val="center"/>
-          <w:tblInd w:w="0" w:type="dxa"/>
-        </w:tblPrEx>
         <w:trPr>
           <w:gridAfter w:val="2"/>
           <w:wAfter w:w="112" w:type="dxa"/>
           <w:trHeight w:val="611"/>
-          <w:jc w:val="center"/>
         </w:trPr>
         <w:tc>
           <w:tcPr>
@@ -14953,15 +15044,10 @@
         </w:tc>
       </w:tr>
       <w:tr>
-        <w:tblPrEx>
-          <w:jc w:val="center"/>
-          <w:tblInd w:w="0" w:type="dxa"/>
-        </w:tblPrEx>
         <w:trPr>
           <w:gridAfter w:val="2"/>
           <w:wAfter w:w="112" w:type="dxa"/>
           <w:trHeight w:val="269"/>
-          <w:jc w:val="center"/>
         </w:trPr>
         <w:tc>
           <w:tcPr>
@@ -14996,15 +15082,10 @@
         </w:tc>
       </w:tr>
       <w:tr>
-        <w:tblPrEx>
-          <w:jc w:val="center"/>
-          <w:tblInd w:w="0" w:type="dxa"/>
-        </w:tblPrEx>
         <w:trPr>
           <w:gridAfter w:val="2"/>
           <w:wAfter w:w="112" w:type="dxa"/>
           <w:trHeight w:val="350"/>
-          <w:jc w:val="center"/>
         </w:trPr>
         <w:tc>
           <w:tcPr>
@@ -15039,15 +15120,10 @@
         </w:tc>
       </w:tr>
       <w:tr>
-        <w:tblPrEx>
-          <w:jc w:val="center"/>
-          <w:tblInd w:w="0" w:type="dxa"/>
-        </w:tblPrEx>
         <w:trPr>
           <w:gridAfter w:val="2"/>
           <w:wAfter w:w="112" w:type="dxa"/>
           <w:trHeight w:val="350"/>
-          <w:jc w:val="center"/>
         </w:trPr>
         <w:tc>
           <w:tcPr>
@@ -15093,15 +15169,10 @@
         </w:tc>
       </w:tr>
       <w:tr>
-        <w:tblPrEx>
-          <w:jc w:val="center"/>
-          <w:tblInd w:w="0" w:type="dxa"/>
-        </w:tblPrEx>
         <w:trPr>
           <w:gridAfter w:val="2"/>
           <w:wAfter w:w="112" w:type="dxa"/>
           <w:trHeight w:val="350"/>
-          <w:jc w:val="center"/>
         </w:trPr>
         <w:tc>
           <w:tcPr>
@@ -15135,14 +15206,9 @@
         </w:tc>
       </w:tr>
       <w:tr>
-        <w:tblPrEx>
-          <w:jc w:val="center"/>
-          <w:tblInd w:w="0" w:type="dxa"/>
-        </w:tblPrEx>
         <w:trPr>
           <w:gridAfter w:val="2"/>
           <w:wAfter w:w="112" w:type="dxa"/>
-          <w:jc w:val="center"/>
         </w:trPr>
         <w:tc>
           <w:tcPr>
@@ -15176,14 +15242,9 @@
         </w:tc>
       </w:tr>
       <w:tr>
-        <w:tblPrEx>
-          <w:jc w:val="center"/>
-          <w:tblInd w:w="0" w:type="dxa"/>
-        </w:tblPrEx>
         <w:trPr>
           <w:gridAfter w:val="2"/>
           <w:wAfter w:w="112" w:type="dxa"/>
-          <w:jc w:val="center"/>
         </w:trPr>
         <w:tc>
           <w:tcPr>

</xml_diff>